<commit_message>
add 4 MERFISH datasets
</commit_message>
<xml_diff>
--- a/README_overall.docx
+++ b/README_overall.docx
@@ -405,8 +405,6 @@
         </w:rPr>
         <w:t>803</w:t>
       </w:r>
-      <w:bookmarkStart w:id="0" w:name="_GoBack"/>
-      <w:bookmarkEnd w:id="0"/>
       <w:r>
         <w:rPr>
           <w:rFonts w:hint="eastAsia" w:ascii="Times New Roman" w:hAnsi="Times New Roman" w:cs="Times New Roman"/>
@@ -5810,13 +5808,28 @@
           <w:rFonts w:hint="default" w:ascii="Times New Roman" w:hAnsi="Times New Roman" w:cs="Times New Roman"/>
           <w:lang w:val="en-US"/>
         </w:rPr>
-        <w:t>1c and 1d</w:t>
-      </w:r>
-      <w:r>
-        <w:rPr>
-          <w:rFonts w:ascii="Times New Roman" w:hAnsi="Times New Roman" w:cs="Times New Roman"/>
-        </w:rPr>
-        <w:t xml:space="preserve"> in the manuscript.</w:t>
+        <w:t xml:space="preserve">1c and 1d </w:t>
+      </w:r>
+      <w:r>
+        <w:rPr>
+          <w:rFonts w:ascii="Times New Roman" w:hAnsi="Times New Roman" w:cs="Times New Roman"/>
+        </w:rPr>
+        <w:t>in the manuscript</w:t>
+      </w:r>
+      <w:r>
+        <w:rPr>
+          <w:rFonts w:hint="default" w:ascii="Times New Roman" w:hAnsi="Times New Roman" w:cs="Times New Roman"/>
+          <w:lang w:val="en-US"/>
+        </w:rPr>
+        <w:t>, and Supplementary Figure S2 in the supplementary materials</w:t>
+      </w:r>
+      <w:bookmarkStart w:id="0" w:name="_GoBack"/>
+      <w:bookmarkEnd w:id="0"/>
+      <w:r>
+        <w:rPr>
+          <w:rFonts w:ascii="Times New Roman" w:hAnsi="Times New Roman" w:cs="Times New Roman"/>
+        </w:rPr>
+        <w:t>.</w:t>
       </w:r>
     </w:p>
     <w:p>

</xml_diff>